<commit_message>
slightly updated the lab4
</commit_message>
<xml_diff>
--- a/lab4/Лаб4_IМ-52_Туманов.docx
+++ b/lab4/Лаб4_IМ-52_Туманов.docx
@@ -40424,12 +40424,14 @@
       <w:pPr>
         <w:pStyle w:val="Normal"/>
         <w:bidi w:val="0"/>
-        <w:spacing w:lineRule="exact" w:line="259" w:before="0" w:after="160"/>
+        <w:spacing w:lineRule="auto" w:line="240" w:before="0" w:after="160"/>
         <w:ind w:hanging="0" w:left="0" w:right="0"/>
         <w:jc w:val="left"/>
         <w:rPr>
-          <w:rFonts w:ascii="Times New Roman" w:hAnsi="Times New Roman" w:eastAsia="Times New Roman" w:cs="Times New Roman"/>
-          <w:color w:val="auto"/>
+          <w:rFonts w:ascii="Adwaita Sans" w:hAnsi="Adwaita Sans" w:eastAsia="Times New Roman" w:cs="Times New Roman"/>
+          <w:b/>
+          <w:bCs/>
+          <w:color w:val="000000"/>
           <w:spacing w:val="0"/>
           <w:sz w:val="32"/>
           <w:u w:val="none"/>
@@ -40439,8 +40441,10 @@
       </w:pPr>
       <w:r>
         <w:rPr>
-          <w:rFonts w:eastAsia="Times New Roman" w:cs="Times New Roman" w:ascii="Times New Roman" w:hAnsi="Times New Roman"/>
-          <w:color w:val="auto"/>
+          <w:rFonts w:eastAsia="Times New Roman" w:cs="Times New Roman" w:ascii="Adwaita Sans" w:hAnsi="Adwaita Sans"/>
+          <w:b/>
+          <w:bCs/>
+          <w:color w:val="000000"/>
           <w:spacing w:val="0"/>
           <w:sz w:val="32"/>
           <w:u w:val="none"/>
@@ -40451,10 +40455,10 @@
           <wp:anchor distT="0" distB="0" distL="0" distR="0" simplePos="0" relativeHeight="2" behindDoc="0" locked="0" layoutInCell="0" allowOverlap="1">
             <wp:simplePos x="0" y="0"/>
             <wp:positionH relativeFrom="column">
-              <wp:posOffset>352425</wp:posOffset>
+              <wp:posOffset>-5080</wp:posOffset>
             </wp:positionH>
             <wp:positionV relativeFrom="paragraph">
-              <wp:posOffset>33655</wp:posOffset>
+              <wp:posOffset>154940</wp:posOffset>
             </wp:positionV>
             <wp:extent cx="5753100" cy="3533775"/>
             <wp:effectExtent l="0" t="0" r="0" b="0"/>
@@ -40493,6 +40497,69 @@
             </a:graphic>
           </wp:anchor>
         </w:drawing>
+        <w:drawing>
+          <wp:anchor distT="0" distB="0" distL="0" distR="0" simplePos="0" relativeHeight="3" behindDoc="0" locked="0" layoutInCell="0" allowOverlap="1">
+            <wp:simplePos x="0" y="0"/>
+            <wp:positionH relativeFrom="column">
+              <wp:posOffset>-776605</wp:posOffset>
+            </wp:positionH>
+            <wp:positionV relativeFrom="paragraph">
+              <wp:posOffset>4009390</wp:posOffset>
+            </wp:positionV>
+            <wp:extent cx="7407910" cy="4047490"/>
+            <wp:effectExtent l="0" t="0" r="0" b="0"/>
+            <wp:wrapTopAndBottom/>
+            <wp:docPr id="2" name="Image2"/>
+            <wp:cNvGraphicFramePr>
+              <a:graphicFrameLocks xmlns:a="http://schemas.openxmlformats.org/drawingml/2006/main" noChangeAspect="1"/>
+            </wp:cNvGraphicFramePr>
+            <a:graphic xmlns:a="http://schemas.openxmlformats.org/drawingml/2006/main">
+              <a:graphicData uri="http://schemas.openxmlformats.org/drawingml/2006/picture">
+                <pic:pic xmlns:pic="http://schemas.openxmlformats.org/drawingml/2006/picture">
+                  <pic:nvPicPr>
+                    <pic:cNvPr id="2" name="Image2"/>
+                    <pic:cNvPicPr>
+                      <a:picLocks noChangeAspect="1" noChangeArrowheads="1"/>
+                    </pic:cNvPicPr>
+                  </pic:nvPicPr>
+                  <pic:blipFill>
+                    <a:blip r:embed="rId3"/>
+                    <a:stretch>
+                      <a:fillRect/>
+                    </a:stretch>
+                  </pic:blipFill>
+                  <pic:spPr bwMode="auto">
+                    <a:xfrm>
+                      <a:off x="0" y="0"/>
+                      <a:ext cx="7407910" cy="4047490"/>
+                    </a:xfrm>
+                    <a:prstGeom prst="rect">
+                      <a:avLst/>
+                    </a:prstGeom>
+                    <a:noFill/>
+                  </pic:spPr>
+                </pic:pic>
+              </a:graphicData>
+            </a:graphic>
+          </wp:anchor>
+        </w:drawing>
+      </w:r>
+      <w:r>
+        <w:rPr>
+          <w:rFonts w:eastAsia="Times New Roman" w:cs="Times New Roman" w:ascii="Adwaita Sans" w:hAnsi="Adwaita Sans"/>
+          <w:b/>
+          <w:bCs/>
+          <w:color w:val="000000"/>
+          <w:spacing w:val="0"/>
+          <w:sz w:val="32"/>
+          <w:u w:val="none"/>
+          <w:shd w:fill="auto" w:val="clear"/>
+          <w:lang w:val="zxx" w:eastAsia="zxx" w:bidi="zxx"/>
+        </w:rPr>
+        <w:t>Діаграма Класів:</w:t>
+      </w:r>
+      <w:r>
+        <w:br w:type="page"/>
       </w:r>
     </w:p>
     <w:p>
@@ -40552,103 +40619,7 @@
           <w:shd w:fill="auto" w:val="clear"/>
           <w:lang w:val="zxx" w:eastAsia="zxx" w:bidi="zxx"/>
         </w:rPr>
-        <w:t xml:space="preserve">У лабораторній работі я використовував С++ та бібліотеку Qt, що для мене вже </w:t>
-      </w:r>
-      <w:r>
-        <w:rPr>
-          <w:rFonts w:eastAsia="Times New Roman" w:cs="Times New Roman" w:ascii="Adwaita Sans" w:hAnsi="Adwaita Sans"/>
-          <w:color w:val="000000"/>
-          <w:spacing w:val="0"/>
-          <w:sz w:val="32"/>
-          <w:u w:val="single"/>
-          <w:shd w:fill="auto" w:val="clear"/>
-          <w:lang w:val="zxx" w:eastAsia="zxx" w:bidi="zxx"/>
-        </w:rPr>
-        <w:t>в</w:t>
-      </w:r>
-      <w:r>
-        <w:rPr>
-          <w:rFonts w:eastAsia="Times New Roman" w:cs="Times New Roman" w:ascii="Adwaita Sans" w:hAnsi="Adwaita Sans"/>
-          <w:color w:val="000000"/>
-          <w:spacing w:val="0"/>
-          <w:sz w:val="32"/>
-          <w:u w:val="single"/>
-          <w:shd w:fill="auto" w:val="clear"/>
-          <w:lang w:val="zxx" w:eastAsia="zxx" w:bidi="zxx"/>
-        </w:rPr>
-        <w:t>ч</w:t>
-      </w:r>
-      <w:r>
-        <w:rPr>
-          <w:rFonts w:eastAsia="Times New Roman" w:cs="Times New Roman" w:ascii="Adwaita Sans" w:hAnsi="Adwaita Sans"/>
-          <w:color w:val="000000"/>
-          <w:spacing w:val="0"/>
-          <w:sz w:val="32"/>
-          <w:u w:val="single"/>
-          <w:shd w:fill="auto" w:val="clear"/>
-          <w:lang w:val="zxx" w:eastAsia="zxx" w:bidi="zxx"/>
-        </w:rPr>
-        <w:t>етверте</w:t>
-      </w:r>
-      <w:r>
-        <w:rPr>
-          <w:rFonts w:eastAsia="Times New Roman" w:cs="Times New Roman" w:ascii="Adwaita Sans" w:hAnsi="Adwaita Sans"/>
-          <w:color w:val="000000"/>
-          <w:spacing w:val="0"/>
-          <w:sz w:val="32"/>
-          <w:u w:val="single"/>
-          <w:shd w:fill="auto" w:val="clear"/>
-          <w:lang w:val="zxx" w:eastAsia="zxx" w:bidi="zxx"/>
-        </w:rPr>
-        <w:t xml:space="preserve"> у обох деталях. Як IDE використовував Qt Creator, але як і у попередній роботі, більшість інтерфейсу була створена через код, через що його так помітно більше. </w:t>
-      </w:r>
-      <w:r>
-        <w:rPr>
-          <w:rFonts w:eastAsia="Times New Roman" w:cs="Times New Roman" w:ascii="Adwaita Sans" w:hAnsi="Adwaita Sans"/>
-          <w:color w:val="000000"/>
-          <w:spacing w:val="0"/>
-          <w:sz w:val="32"/>
-          <w:u w:val="single"/>
-          <w:shd w:fill="auto" w:val="clear"/>
-          <w:lang w:val="zxx" w:eastAsia="zxx" w:bidi="zxx"/>
-        </w:rPr>
-        <w:t>С</w:t>
-      </w:r>
-      <w:r>
-        <w:rPr>
-          <w:rFonts w:eastAsia="Times New Roman" w:cs="Times New Roman" w:ascii="Adwaita Sans" w:hAnsi="Adwaita Sans"/>
-          <w:color w:val="000000"/>
-          <w:spacing w:val="0"/>
-          <w:sz w:val="32"/>
-          <w:u w:val="single"/>
-          <w:shd w:fill="auto" w:val="clear"/>
-          <w:lang w:val="zxx" w:eastAsia="zxx" w:bidi="zxx"/>
-        </w:rPr>
-        <w:t>т</w:t>
-      </w:r>
-      <w:r>
-        <w:rPr>
-          <w:rFonts w:eastAsia="Times New Roman" w:cs="Times New Roman" w:ascii="Adwaita Sans" w:hAnsi="Adwaita Sans"/>
-          <w:color w:val="000000"/>
-          <w:spacing w:val="0"/>
-          <w:sz w:val="32"/>
-          <w:u w:val="single"/>
-          <w:shd w:fill="auto" w:val="clear"/>
-          <w:lang w:val="zxx" w:eastAsia="zxx" w:bidi="zxx"/>
-        </w:rPr>
-        <w:t>в</w:t>
-      </w:r>
-      <w:r>
-        <w:rPr>
-          <w:rFonts w:eastAsia="Times New Roman" w:cs="Times New Roman" w:ascii="Adwaita Sans" w:hAnsi="Adwaita Sans"/>
-          <w:color w:val="000000"/>
-          <w:spacing w:val="0"/>
-          <w:sz w:val="32"/>
-          <w:u w:val="single"/>
-          <w:shd w:fill="auto" w:val="clear"/>
-          <w:lang w:val="zxx" w:eastAsia="zxx" w:bidi="zxx"/>
-        </w:rPr>
-        <w:t>орення додаткових форм не було складністю зовсім, просто створив новий клас, додав логіку на основі успадковиних функцій, і додав у меню нові елементи.</w:t>
+        <w:t>У лабораторній работі я використовував С++ та бібліотеку Qt, що для мене вже вчетверте у обох деталях. Як IDE використовував Qt Creator, але як і у попередній роботі, більшість інтерфейсу була створена через код, через що його так помітно більше. Створення додаткових форм не було складністю зовсім, просто створив новий клас, додав логіку на основі успадковиних функцій, і додав у меню нові елементи.</w:t>
       </w:r>
     </w:p>
     <w:sectPr>

</xml_diff>